<commit_message>
Keep outage credits out of the refund reason codes
The refund procedure and billing screenshot listed RF-04 Outage credit as
a card refund, while the outage FAQ says credits go on the next invoice
and are never paid to a card. RF-04 is now retired: outage credits use
Credits > Outage credit in the billing console. Found by Codex review.

Co-Authored-By: Claude Opus 5.5 (1M context) <noreply@anthropic.com>
</commit_message>
<xml_diff>
--- a/docs/demo-kb/files/refund-procedure.docx
+++ b/docs/demo-kb/files/refund-procedure.docx
@@ -147,7 +147,7 @@
         <w:pStyle w:val="ListNumber"/>
       </w:pPr>
       <w:r>
-        <w:t>Add a one-line reason code (RF-01 to RF-05).</w:t>
+        <w:t>Add a one-line reason code (RF-01, RF-02, RF-03 or RF-05).</w:t>
       </w:r>
     </w:p>
     <w:p>
@@ -324,38 +324,6 @@
           </w:tcPr>
           <w:p>
             <w:r>
-              <w:t>RF-04</w:t>
-            </w:r>
-          </w:p>
-        </w:tc>
-        <w:tc>
-          <w:tcPr>
-            <w:tcW w:type="dxa" w:w="2880"/>
-          </w:tcPr>
-          <w:p>
-            <w:r>
-              <w:t>Outage credit (Enterprise SLA)</w:t>
-            </w:r>
-          </w:p>
-        </w:tc>
-        <w:tc>
-          <w:tcPr>
-            <w:tcW w:type="dxa" w:w="2880"/>
-          </w:tcPr>
-          <w:p>
-            <w:r>
-              <w:t>Billing Operations confirms uptime</w:t>
-            </w:r>
-          </w:p>
-        </w:tc>
-      </w:tr>
-      <w:tr>
-        <w:tc>
-          <w:tcPr>
-            <w:tcW w:type="dxa" w:w="2880"/>
-          </w:tcPr>
-          <w:p>
-            <w:r>
               <w:t>RF-05</w:t>
             </w:r>
           </w:p>
@@ -383,6 +351,17 @@
       </w:tr>
     </w:tbl>
     <w:p/>
+    <w:p>
+      <w:r>
+        <w:rPr>
+          <w:b/>
+        </w:rPr>
+        <w:t xml:space="preserve">Outage credits: </w:t>
+      </w:r>
+      <w:r>
+        <w:t>RF-04 is retired. Enterprise outage credits are not refunds: they go on the next invoice through Credits &gt; Outage credit in the billing console, never to a card (see the Outages and Service Credits FAQ).</w:t>
+      </w:r>
+    </w:p>
     <w:p>
       <w:pPr>
         <w:pStyle w:val="Heading1"/>

</xml_diff>